<commit_message>
dodat noviKlijent.pas i dodat noviZahtev.pas
</commit_message>
<xml_diff>
--- a/Plan realizacije.docx
+++ b/Plan realizacije.docx
@@ -389,7 +389,23 @@
                 <w:sz w:val="24"/>
                 <w:szCs w:val="24"/>
               </w:rPr>
-              <w:t>.5.2026</w:t>
+              <w:t>.</w:t>
+            </w:r>
+            <w:r>
+              <w:rPr>
+                <w:rFonts w:eastAsia="Times New Roman" w:cstheme="minorHAnsi"/>
+                <w:sz w:val="24"/>
+                <w:szCs w:val="24"/>
+              </w:rPr>
+              <w:t>4</w:t>
+            </w:r>
+            <w:r>
+              <w:rPr>
+                <w:rFonts w:eastAsia="Times New Roman" w:cstheme="minorHAnsi"/>
+                <w:sz w:val="24"/>
+                <w:szCs w:val="24"/>
+              </w:rPr>
+              <w:t>.2026</w:t>
             </w:r>
           </w:p>
         </w:tc>

</xml_diff>